<commit_message>
fix: Izin Keluar Kantor - Pegawai balik ke format lokal, Hakim dirapikan rata kiri
Pegawai: kembali ke template versi 1 (Dengan ini saya + Mengetahui
Ketua/Wakil Ketua), membatalkan 019. Hakim: format PERMA 7/2016 tetap,
isian rata kiri dan sejajar dengan label, garis bawah nama dihapus.
Migrasi 036 memulihkan peran/variabel mengetahui dan memasang versi
template baru untuk kedua sub_jenis.

Co-Authored-By: Claude Opus 5.5 <noreply@anthropic.com>
</commit_message>
<xml_diff>
--- a/templates/izin_keluar_kantor_hakim.docx
+++ b/templates/izin_keluar_kantor_hakim.docx
@@ -70,15 +70,14 @@
         <w:gridCol w:w="5736"/>
       </w:tblGrid>
       <w:tr>
-        <w:trPr>
-          <w:trHeight w:val="451"/>
-        </w:trPr>
+        <w:trPr/>
         <w:tc>
           <w:tcPr>
             <w:tcW w:w="2959" w:type="dxa"/>
           </w:tcPr>
           <w:p>
             <w:pPr>
+              <w:spacing w:after="200"/>
               <w:rPr>
                 <w:rFonts w:ascii="Arial" w:eastAsia="Bookman Old Style" w:hAnsi="Arial" w:cs="Arial"/>
                 <w:sz w:val="24"/>
@@ -165,6 +164,7 @@
           </w:tcPr>
           <w:p>
             <w:pPr>
+              <w:spacing w:after="200"/>
               <w:jc w:val="center"/>
               <w:rPr>
                 <w:rFonts w:ascii="Arial" w:eastAsia="Bookman Old Style" w:hAnsi="Arial" w:cs="Arial"/>
@@ -188,7 +188,7 @@
           </w:tcPr>
           <w:p>
             <w:pPr>
-              <w:jc w:val="center"/>
+              <w:spacing w:after="200"/>
               <w:rPr>
                 <w:rFonts w:ascii="Arial" w:eastAsia="Bookman Old Style" w:hAnsi="Arial" w:cs="Arial"/>
                 <w:sz w:val="24"/>
@@ -215,24 +215,14 @@
         </w:tc>
       </w:tr>
       <w:tr>
-        <w:trPr>
-          <w:trHeight w:val="513"/>
-        </w:trPr>
+        <w:trPr/>
         <w:tc>
           <w:tcPr>
             <w:tcW w:w="2959" w:type="dxa"/>
           </w:tcPr>
           <w:p>
             <w:pPr>
-              <w:rPr>
-                <w:rFonts w:ascii="Arial" w:eastAsia="Bookman Old Style" w:hAnsi="Arial" w:cs="Arial"/>
-                <w:sz w:val="24"/>
-                <w:szCs w:val="24"/>
-              </w:rPr>
-            </w:pPr>
-          </w:p>
-          <w:p>
-            <w:pPr>
+              <w:spacing w:after="200"/>
               <w:rPr>
                 <w:rFonts w:ascii="Arial" w:eastAsia="Bookman Old Style" w:hAnsi="Arial" w:cs="Arial"/>
                 <w:sz w:val="24"/>
@@ -257,16 +247,7 @@
           </w:tcPr>
           <w:p>
             <w:pPr>
-              <w:jc w:val="center"/>
-              <w:rPr>
-                <w:rFonts w:ascii="Arial" w:eastAsia="Bookman Old Style" w:hAnsi="Arial" w:cs="Arial"/>
-                <w:sz w:val="24"/>
-                <w:szCs w:val="24"/>
-              </w:rPr>
-            </w:pPr>
-          </w:p>
-          <w:p>
-            <w:pPr>
+              <w:spacing w:after="200"/>
               <w:jc w:val="center"/>
               <w:rPr>
                 <w:rFonts w:ascii="Arial" w:eastAsia="Bookman Old Style" w:hAnsi="Arial" w:cs="Arial"/>
@@ -290,7 +271,7 @@
           </w:tcPr>
           <w:p>
             <w:pPr>
-              <w:jc w:val="center"/>
+              <w:spacing w:after="200"/>
               <w:rPr>
                 <w:rFonts w:ascii="Arial" w:eastAsia="Bookman Old Style" w:hAnsi="Arial" w:cs="Arial"/>
                 <w:sz w:val="24"/>
@@ -309,24 +290,14 @@
         </w:tc>
       </w:tr>
       <w:tr>
-        <w:trPr>
-          <w:trHeight w:val="993"/>
-        </w:trPr>
+        <w:trPr/>
         <w:tc>
           <w:tcPr>
             <w:tcW w:w="2959" w:type="dxa"/>
           </w:tcPr>
           <w:p>
             <w:pPr>
-              <w:rPr>
-                <w:rFonts w:ascii="Arial" w:eastAsia="Bookman Old Style" w:hAnsi="Arial" w:cs="Arial"/>
-                <w:sz w:val="24"/>
-                <w:szCs w:val="24"/>
-              </w:rPr>
-            </w:pPr>
-          </w:p>
-          <w:p>
-            <w:pPr>
+              <w:spacing w:after="200"/>
               <w:rPr>
                 <w:rFonts w:ascii="Arial" w:eastAsia="Bookman Old Style" w:hAnsi="Arial" w:cs="Arial"/>
                 <w:sz w:val="24"/>
@@ -413,16 +384,7 @@
           </w:tcPr>
           <w:p>
             <w:pPr>
-              <w:jc w:val="center"/>
-              <w:rPr>
-                <w:rFonts w:ascii="Arial" w:eastAsia="Bookman Old Style" w:hAnsi="Arial" w:cs="Arial"/>
-                <w:sz w:val="24"/>
-                <w:szCs w:val="24"/>
-              </w:rPr>
-            </w:pPr>
-          </w:p>
-          <w:p>
-            <w:pPr>
+              <w:spacing w:after="200"/>
               <w:jc w:val="center"/>
               <w:rPr>
                 <w:rFonts w:ascii="Arial" w:eastAsia="Bookman Old Style" w:hAnsi="Arial" w:cs="Arial"/>
@@ -446,10 +408,6 @@
           </w:tcPr>
           <w:p>
             <w:pPr>
-              <w:pBdr>
-                <w:bottom w:val="single" w:sz="12" w:space="1" w:color="auto"/>
-              </w:pBdr>
-              <w:jc w:val="center"/>
               <w:rPr>
                 <w:rFonts w:ascii="Arial" w:eastAsia="Bookman Old Style" w:hAnsi="Arial" w:cs="Arial"/>
                 <w:sz w:val="24"/>
@@ -467,36 +425,13 @@
           </w:p>
           <w:p>
             <w:pPr>
-              <w:pBdr>
-                <w:bottom w:val="single" w:sz="12" w:space="1" w:color="auto"/>
-              </w:pBdr>
-              <w:jc w:val="center"/>
+              <w:spacing w:after="200"/>
               <w:rPr>
                 <w:rFonts w:ascii="Arial" w:eastAsia="Bookman Old Style" w:hAnsi="Arial" w:cs="Arial"/>
                 <w:sz w:val="24"/>
                 <w:szCs w:val="24"/>
               </w:rPr>
             </w:pPr>
-          </w:p>
-          <w:p>
-            <w:pPr>
-              <w:jc w:val="center"/>
-              <w:rPr>
-                <w:rFonts w:ascii="Arial" w:eastAsia="Bookman Old Style" w:hAnsi="Arial" w:cs="Arial"/>
-                <w:sz w:val="24"/>
-                <w:szCs w:val="24"/>
-              </w:rPr>
-            </w:pPr>
-          </w:p>
-          <w:p>
-            <w:pPr>
-              <w:jc w:val="center"/>
-              <w:rPr>
-                <w:rFonts w:ascii="Arial" w:eastAsia="Bookman Old Style" w:hAnsi="Arial" w:cs="Arial"/>
-                <w:sz w:val="24"/>
-                <w:szCs w:val="24"/>
-              </w:rPr>
-            </w:pPr>
             <w:r>
               <w:rPr>
                 <w:rFonts w:ascii="Arial" w:eastAsia="Bookman Old Style" w:hAnsi="Arial" w:cs="Arial"/>
@@ -513,29 +448,18 @@
               </w:rPr>
               <w:t/>
             </w:r>
-          </w:p>
-          <w:p>
-            <w:pPr>
-              <w:jc w:val="center"/>
-              <w:rPr>
-                <w:rFonts w:ascii="Arial" w:eastAsia="Bookman Old Style" w:hAnsi="Arial" w:cs="Arial"/>
-                <w:sz w:val="24"/>
-                <w:szCs w:val="24"/>
-              </w:rPr>
-            </w:pPr>
           </w:p>
         </w:tc>
       </w:tr>
       <w:tr>
-        <w:trPr>
-          <w:trHeight w:val="902"/>
-        </w:trPr>
+        <w:trPr/>
         <w:tc>
           <w:tcPr>
             <w:tcW w:w="2959" w:type="dxa"/>
           </w:tcPr>
           <w:p>
             <w:pPr>
+              <w:spacing w:after="200"/>
               <w:rPr>
                 <w:rFonts w:ascii="Arial" w:eastAsia="Bookman Old Style" w:hAnsi="Arial" w:cs="Arial"/>
                 <w:sz w:val="24"/>
@@ -604,6 +528,7 @@
           </w:tcPr>
           <w:p>
             <w:pPr>
+              <w:spacing w:after="200"/>
               <w:jc w:val="center"/>
               <w:rPr>
                 <w:rFonts w:ascii="Arial" w:eastAsia="Bookman Old Style" w:hAnsi="Arial" w:cs="Arial"/>
@@ -627,7 +552,6 @@
           </w:tcPr>
           <w:p>
             <w:pPr>
-              <w:jc w:val="center"/>
               <w:rPr>
                 <w:rFonts w:ascii="Arial" w:eastAsia="Bookman Old Style" w:hAnsi="Arial" w:cs="Arial"/>
                 <w:sz w:val="24"/>
@@ -645,17 +569,7 @@
           </w:p>
           <w:p>
             <w:pPr>
-              <w:jc w:val="center"/>
-              <w:rPr>
-                <w:rFonts w:ascii="Arial" w:eastAsia="Bookman Old Style" w:hAnsi="Arial" w:cs="Arial"/>
-                <w:sz w:val="24"/>
-                <w:szCs w:val="24"/>
-              </w:rPr>
-            </w:pPr>
-          </w:p>
-          <w:p>
-            <w:pPr>
-              <w:jc w:val="center"/>
+              <w:spacing w:after="200"/>
               <w:rPr>
                 <w:rFonts w:ascii="Arial" w:eastAsia="Bookman Old Style" w:hAnsi="Arial" w:cs="Arial"/>
                 <w:sz w:val="24"/>
@@ -698,29 +612,18 @@
               </w:rPr>
               <w:t xml:space="preserve"> ${jam_selesai_izin}</w:t>
             </w:r>
-          </w:p>
-          <w:p>
-            <w:pPr>
-              <w:jc w:val="center"/>
-              <w:rPr>
-                <w:rFonts w:ascii="Arial" w:eastAsia="Bookman Old Style" w:hAnsi="Arial" w:cs="Arial"/>
-                <w:sz w:val="24"/>
-                <w:szCs w:val="24"/>
-              </w:rPr>
-            </w:pPr>
           </w:p>
         </w:tc>
       </w:tr>
       <w:tr>
-        <w:trPr>
-          <w:trHeight w:val="341"/>
-        </w:trPr>
+        <w:trPr/>
         <w:tc>
           <w:tcPr>
             <w:tcW w:w="2959" w:type="dxa"/>
           </w:tcPr>
           <w:p>
             <w:pPr>
+              <w:spacing w:after="200"/>
               <w:rPr>
                 <w:rFonts w:ascii="Arial" w:eastAsia="Bookman Old Style" w:hAnsi="Arial" w:cs="Arial"/>
                 <w:sz w:val="24"/>
@@ -763,6 +666,7 @@
           </w:tcPr>
           <w:p>
             <w:pPr>
+              <w:spacing w:after="200"/>
               <w:jc w:val="center"/>
               <w:rPr>
                 <w:rFonts w:ascii="Arial" w:eastAsia="Bookman Old Style" w:hAnsi="Arial" w:cs="Arial"/>
@@ -786,7 +690,7 @@
           </w:tcPr>
           <w:p>
             <w:pPr>
-              <w:jc w:val="center"/>
+              <w:spacing w:after="200"/>
               <w:rPr>
                 <w:rFonts w:ascii="Arial" w:eastAsia="Bookman Old Style" w:hAnsi="Arial" w:cs="Arial"/>
                 <w:sz w:val="24"/>

</xml_diff>